<commit_message>
add capability of painting more than one of each objects
</commit_message>
<xml_diff>
--- a/doc/PozadavkyPGRF1_Task1_2026.docx
+++ b/doc/PozadavkyPGRF1_Task1_2026.docx
@@ -298,27 +298,7 @@
                 <w:szCs w:val="24"/>
                 <w:lang w:eastAsia="cs-CZ"/>
               </w:rPr>
-              <w:t xml:space="preserve">Správná </w:t>
-            </w:r>
-            <w:proofErr w:type="spellStart"/>
-            <w:r>
-              <w:rPr>
-                <w:rFonts w:ascii="Arial" w:eastAsia="Times New Roman" w:hAnsi="Arial" w:cs="Arial"/>
-                <w:sz w:val="20"/>
-                <w:szCs w:val="24"/>
-                <w:lang w:eastAsia="cs-CZ"/>
-              </w:rPr>
-              <w:t>rasterizace</w:t>
-            </w:r>
-            <w:proofErr w:type="spellEnd"/>
-            <w:r>
-              <w:rPr>
-                <w:rFonts w:ascii="Arial" w:eastAsia="Times New Roman" w:hAnsi="Arial" w:cs="Arial"/>
-                <w:sz w:val="20"/>
-                <w:szCs w:val="24"/>
-                <w:lang w:eastAsia="cs-CZ"/>
-              </w:rPr>
-              <w:t xml:space="preserve"> ve všech kvadrantech</w:t>
+              <w:t>Správná rasterizace ve všech kvadrantech</w:t>
             </w:r>
             <w:r>
               <w:rPr>
@@ -449,19 +429,8 @@
                 <w:szCs w:val="24"/>
                 <w:lang w:eastAsia="cs-CZ"/>
               </w:rPr>
-              <w:t xml:space="preserve">Označení algoritmu </w:t>
-            </w:r>
-            <w:proofErr w:type="spellStart"/>
-            <w:r>
-              <w:rPr>
-                <w:rFonts w:ascii="Arial" w:eastAsia="Times New Roman" w:hAnsi="Arial" w:cs="Arial"/>
-                <w:sz w:val="20"/>
-                <w:szCs w:val="24"/>
-                <w:lang w:eastAsia="cs-CZ"/>
-              </w:rPr>
-              <w:t>rasterizace</w:t>
-            </w:r>
-            <w:proofErr w:type="spellEnd"/>
+              <w:t>Označení algoritmu rasterizace</w:t>
+            </w:r>
             <w:r>
               <w:rPr>
                 <w:rFonts w:ascii="Arial" w:eastAsia="Times New Roman" w:hAnsi="Arial" w:cs="Arial"/>
@@ -680,6 +649,26 @@
                 <w:lang w:eastAsia="cs-CZ"/>
               </w:rPr>
             </w:pPr>
+            <w:r>
+              <w:rPr>
+                <w:rFonts w:ascii="Times New Roman" w:eastAsia="Times New Roman" w:hAnsi="Times New Roman" w:cs="Times New Roman"/>
+                <w:sz w:val="20"/>
+                <w:szCs w:val="20"/>
+                <w:highlight w:val="yellow"/>
+                <w:lang w:val="en-US" w:eastAsia="cs-CZ"/>
+              </w:rPr>
+              <w:t>Dr</w:t>
+            </w:r>
+            <w:r>
+              <w:rPr>
+                <w:rFonts w:ascii="Times New Roman" w:eastAsia="Times New Roman" w:hAnsi="Times New Roman" w:cs="Times New Roman"/>
+                <w:sz w:val="20"/>
+                <w:szCs w:val="20"/>
+                <w:highlight w:val="yellow"/>
+                <w:lang w:eastAsia="cs-CZ"/>
+              </w:rPr>
+              <w:t>ží se LEVÉ tlačítko a táhne myší</w:t>
+            </w:r>
           </w:p>
         </w:tc>
         <w:tc>
@@ -698,6 +687,42 @@
                 <w:lang w:eastAsia="cs-CZ"/>
               </w:rPr>
             </w:pPr>
+            <w:r>
+              <w:rPr>
+                <w:rFonts w:ascii="Times New Roman" w:eastAsia="Times New Roman" w:hAnsi="Times New Roman" w:cs="Times New Roman"/>
+                <w:sz w:val="20"/>
+                <w:szCs w:val="20"/>
+                <w:lang w:eastAsia="cs-CZ"/>
+              </w:rPr>
+              <w:t xml:space="preserve">První bod </w:t>
+            </w:r>
+            <w:r>
+              <w:rPr>
+                <w:rFonts w:ascii="Times New Roman" w:eastAsia="Times New Roman" w:hAnsi="Times New Roman" w:cs="Times New Roman"/>
+                <w:sz w:val="20"/>
+                <w:szCs w:val="20"/>
+                <w:lang w:eastAsia="cs-CZ"/>
+              </w:rPr>
+              <w:t xml:space="preserve">nové úsečky </w:t>
+            </w:r>
+            <w:r>
+              <w:rPr>
+                <w:rFonts w:ascii="Times New Roman" w:eastAsia="Times New Roman" w:hAnsi="Times New Roman" w:cs="Times New Roman"/>
+                <w:sz w:val="20"/>
+                <w:szCs w:val="20"/>
+                <w:lang w:eastAsia="cs-CZ"/>
+              </w:rPr>
+              <w:t>se položí, tam kde uživatel tlačítko stiskne, a druhý, tam kde ho pustí.</w:t>
+            </w:r>
+            <w:r>
+              <w:rPr>
+                <w:rFonts w:ascii="Times New Roman" w:eastAsia="Times New Roman" w:hAnsi="Times New Roman" w:cs="Times New Roman"/>
+                <w:sz w:val="20"/>
+                <w:szCs w:val="20"/>
+                <w:lang w:eastAsia="cs-CZ"/>
+              </w:rPr>
+              <w:t xml:space="preserve"> </w:t>
+            </w:r>
           </w:p>
         </w:tc>
       </w:tr>
@@ -786,7 +811,7 @@
                 <w:highlight w:val="yellow"/>
                 <w:lang w:eastAsia="cs-CZ"/>
               </w:rPr>
-              <w:t>50</w:t>
+              <w:t>100</w:t>
             </w:r>
           </w:p>
         </w:tc>
@@ -808,6 +833,26 @@
                 <w:lang w:eastAsia="cs-CZ"/>
               </w:rPr>
             </w:pPr>
+            <w:r>
+              <w:rPr>
+                <w:rFonts w:ascii="Times New Roman" w:eastAsia="Times New Roman" w:hAnsi="Times New Roman" w:cs="Times New Roman"/>
+                <w:sz w:val="20"/>
+                <w:szCs w:val="20"/>
+                <w:highlight w:val="yellow"/>
+                <w:lang w:val="en-US" w:eastAsia="cs-CZ"/>
+              </w:rPr>
+              <w:t>Dr</w:t>
+            </w:r>
+            <w:r>
+              <w:rPr>
+                <w:rFonts w:ascii="Times New Roman" w:eastAsia="Times New Roman" w:hAnsi="Times New Roman" w:cs="Times New Roman"/>
+                <w:sz w:val="20"/>
+                <w:szCs w:val="20"/>
+                <w:highlight w:val="yellow"/>
+                <w:lang w:eastAsia="cs-CZ"/>
+              </w:rPr>
+              <w:t>ží se LEVÉ tlačítko a táhne myší</w:t>
+            </w:r>
           </w:p>
         </w:tc>
         <w:tc>
@@ -1157,7 +1202,7 @@
                 <w:highlight w:val="yellow"/>
                 <w:lang w:eastAsia="cs-CZ"/>
               </w:rPr>
-              <w:t>50</w:t>
+              <w:t>100</w:t>
             </w:r>
           </w:p>
         </w:tc>
@@ -1176,9 +1221,19 @@
                 <w:sz w:val="20"/>
                 <w:szCs w:val="24"/>
                 <w:highlight w:val="yellow"/>
-                <w:lang w:eastAsia="cs-CZ"/>
-              </w:rPr>
-            </w:pPr>
+                <w:lang w:val="en-US" w:eastAsia="cs-CZ"/>
+              </w:rPr>
+            </w:pPr>
+            <w:r>
+              <w:rPr>
+                <w:rFonts w:ascii="Arial" w:eastAsia="Times New Roman" w:hAnsi="Arial" w:cs="Arial"/>
+                <w:sz w:val="20"/>
+                <w:szCs w:val="24"/>
+                <w:highlight w:val="yellow"/>
+                <w:lang w:eastAsia="cs-CZ"/>
+              </w:rPr>
+              <w:t>Klávesou A se přidá nový polygon a následně se kliká LEVÝM tlačítkem a přidává body</w:t>
+            </w:r>
           </w:p>
         </w:tc>
         <w:tc>
@@ -1439,7 +1494,6 @@
         </w:trPr>
         <w:tc>
           <w:tcPr>
-            <w:cnfStyle w:val="001000000000" w:firstRow="0" w:lastRow="0" w:firstColumn="1" w:lastColumn="0" w:oddVBand="0" w:evenVBand="0" w:oddHBand="0" w:evenHBand="0" w:firstRowFirstColumn="0" w:firstRowLastColumn="0" w:lastRowFirstColumn="0" w:lastRowLastColumn="0"/>
             <w:tcW w:w="1980" w:type="dxa"/>
             <w:vMerge w:val="restart"/>
             <w:noWrap/>
@@ -1447,6 +1501,7 @@
           </w:tcPr>
           <w:p>
             <w:pPr>
+              <w:cnfStyle w:val="001000000000" w:firstRow="0" w:lastRow="0" w:firstColumn="1" w:lastColumn="0" w:oddVBand="0" w:evenVBand="0" w:oddHBand="0" w:evenHBand="0" w:firstRowFirstColumn="0" w:firstRowLastColumn="0" w:lastRowFirstColumn="0" w:lastRowLastColumn="0"/>
               <w:rPr>
                 <w:rFonts w:ascii="Arial" w:eastAsia="Times New Roman" w:hAnsi="Arial" w:cs="Arial"/>
                 <w:sz w:val="20"/>
@@ -1472,7 +1527,6 @@
           </w:tcPr>
           <w:p>
             <w:pPr>
-              <w:cnfStyle w:val="000000000000" w:firstRow="0" w:lastRow="0" w:firstColumn="0" w:lastColumn="0" w:oddVBand="0" w:evenVBand="0" w:oddHBand="0" w:evenHBand="0" w:firstRowFirstColumn="0" w:firstRowLastColumn="0" w:lastRowFirstColumn="0" w:lastRowLastColumn="0"/>
               <w:rPr>
                 <w:rFonts w:ascii="Arial" w:eastAsia="Times New Roman" w:hAnsi="Arial" w:cs="Arial"/>
                 <w:sz w:val="20"/>
@@ -1501,14 +1555,22 @@
           <w:p>
             <w:pPr>
               <w:jc w:val="center"/>
-              <w:cnfStyle w:val="000000000000" w:firstRow="0" w:lastRow="0" w:firstColumn="0" w:lastColumn="0" w:oddVBand="0" w:evenVBand="0" w:oddHBand="0" w:evenHBand="0" w:firstRowFirstColumn="0" w:firstRowLastColumn="0" w:lastRowFirstColumn="0" w:lastRowLastColumn="0"/>
-              <w:rPr>
-                <w:rFonts w:ascii="Arial" w:eastAsia="Times New Roman" w:hAnsi="Arial" w:cs="Arial"/>
-                <w:sz w:val="20"/>
-                <w:szCs w:val="24"/>
-                <w:lang w:eastAsia="cs-CZ"/>
-              </w:rPr>
-            </w:pPr>
+              <w:rPr>
+                <w:rFonts w:ascii="Arial" w:eastAsia="Times New Roman" w:hAnsi="Arial" w:cs="Arial"/>
+                <w:sz w:val="20"/>
+                <w:szCs w:val="24"/>
+                <w:lang w:eastAsia="cs-CZ"/>
+              </w:rPr>
+            </w:pPr>
+            <w:r>
+              <w:rPr>
+                <w:rFonts w:ascii="Arial" w:eastAsia="Times New Roman" w:hAnsi="Arial" w:cs="Arial"/>
+                <w:sz w:val="20"/>
+                <w:szCs w:val="24"/>
+                <w:lang w:eastAsia="cs-CZ"/>
+              </w:rPr>
+              <w:t>0</w:t>
+            </w:r>
           </w:p>
         </w:tc>
         <w:tc>
@@ -1521,7 +1583,6 @@
           <w:p>
             <w:pPr>
               <w:jc w:val="center"/>
-              <w:cnfStyle w:val="000000000000" w:firstRow="0" w:lastRow="0" w:firstColumn="0" w:lastColumn="0" w:oddVBand="0" w:evenVBand="0" w:oddHBand="0" w:evenHBand="0" w:firstRowFirstColumn="0" w:firstRowLastColumn="0" w:lastRowFirstColumn="0" w:lastRowLastColumn="0"/>
               <w:rPr>
                 <w:rFonts w:ascii="Times New Roman" w:eastAsia="Times New Roman" w:hAnsi="Times New Roman" w:cs="Times New Roman"/>
                 <w:sz w:val="20"/>
@@ -1539,7 +1600,6 @@
           </w:tcPr>
           <w:p>
             <w:pPr>
-              <w:cnfStyle w:val="000000000000" w:firstRow="0" w:lastRow="0" w:firstColumn="0" w:lastColumn="0" w:oddVBand="0" w:evenVBand="0" w:oddHBand="0" w:evenHBand="0" w:firstRowFirstColumn="0" w:firstRowLastColumn="0" w:lastRowFirstColumn="0" w:lastRowLastColumn="0"/>
               <w:rPr>
                 <w:rFonts w:ascii="Times New Roman" w:eastAsia="Times New Roman" w:hAnsi="Times New Roman" w:cs="Times New Roman"/>
                 <w:sz w:val="20"/>
@@ -1618,6 +1678,15 @@
                 <w:lang w:eastAsia="cs-CZ"/>
               </w:rPr>
             </w:pPr>
+            <w:r>
+              <w:rPr>
+                <w:rFonts w:ascii="Arial" w:eastAsia="Times New Roman" w:hAnsi="Arial" w:cs="Arial"/>
+                <w:sz w:val="20"/>
+                <w:szCs w:val="24"/>
+                <w:lang w:eastAsia="cs-CZ"/>
+              </w:rPr>
+              <w:t>0</w:t>
+            </w:r>
           </w:p>
         </w:tc>
         <w:tc>
@@ -1665,7 +1734,6 @@
         </w:trPr>
         <w:tc>
           <w:tcPr>
-            <w:cnfStyle w:val="001000000000" w:firstRow="0" w:lastRow="0" w:firstColumn="1" w:lastColumn="0" w:oddVBand="0" w:evenVBand="0" w:oddHBand="0" w:evenHBand="0" w:firstRowFirstColumn="0" w:firstRowLastColumn="0" w:lastRowFirstColumn="0" w:lastRowLastColumn="0"/>
             <w:tcW w:w="1980" w:type="dxa"/>
             <w:vMerge/>
             <w:noWrap/>
@@ -1673,6 +1741,7 @@
           </w:tcPr>
           <w:p>
             <w:pPr>
+              <w:cnfStyle w:val="001000000000" w:firstRow="0" w:lastRow="0" w:firstColumn="1" w:lastColumn="0" w:oddVBand="0" w:evenVBand="0" w:oddHBand="0" w:evenHBand="0" w:firstRowFirstColumn="0" w:firstRowLastColumn="0" w:lastRowFirstColumn="0" w:lastRowLastColumn="0"/>
               <w:rPr>
                 <w:rFonts w:ascii="Times New Roman" w:eastAsia="Times New Roman" w:hAnsi="Times New Roman" w:cs="Times New Roman"/>
                 <w:sz w:val="20"/>
@@ -1689,7 +1758,6 @@
           </w:tcPr>
           <w:p>
             <w:pPr>
-              <w:cnfStyle w:val="000000000000" w:firstRow="0" w:lastRow="0" w:firstColumn="0" w:lastColumn="0" w:oddVBand="0" w:evenVBand="0" w:oddHBand="0" w:evenHBand="0" w:firstRowFirstColumn="0" w:firstRowLastColumn="0" w:lastRowFirstColumn="0" w:lastRowLastColumn="0"/>
               <w:rPr>
                 <w:rFonts w:ascii="Arial" w:eastAsia="Times New Roman" w:hAnsi="Arial" w:cs="Arial"/>
                 <w:sz w:val="20"/>
@@ -1718,14 +1786,22 @@
           <w:p>
             <w:pPr>
               <w:jc w:val="center"/>
-              <w:cnfStyle w:val="000000000000" w:firstRow="0" w:lastRow="0" w:firstColumn="0" w:lastColumn="0" w:oddVBand="0" w:evenVBand="0" w:oddHBand="0" w:evenHBand="0" w:firstRowFirstColumn="0" w:firstRowLastColumn="0" w:lastRowFirstColumn="0" w:lastRowLastColumn="0"/>
-              <w:rPr>
-                <w:rFonts w:ascii="Arial" w:eastAsia="Times New Roman" w:hAnsi="Arial" w:cs="Arial"/>
-                <w:sz w:val="20"/>
-                <w:szCs w:val="24"/>
-                <w:lang w:eastAsia="cs-CZ"/>
-              </w:rPr>
-            </w:pPr>
+              <w:rPr>
+                <w:rFonts w:ascii="Arial" w:eastAsia="Times New Roman" w:hAnsi="Arial" w:cs="Arial"/>
+                <w:sz w:val="20"/>
+                <w:szCs w:val="24"/>
+                <w:lang w:eastAsia="cs-CZ"/>
+              </w:rPr>
+            </w:pPr>
+            <w:r>
+              <w:rPr>
+                <w:rFonts w:ascii="Arial" w:eastAsia="Times New Roman" w:hAnsi="Arial" w:cs="Arial"/>
+                <w:sz w:val="20"/>
+                <w:szCs w:val="24"/>
+                <w:lang w:eastAsia="cs-CZ"/>
+              </w:rPr>
+              <w:t>0</w:t>
+            </w:r>
           </w:p>
         </w:tc>
         <w:tc>
@@ -1738,7 +1814,6 @@
           <w:p>
             <w:pPr>
               <w:jc w:val="center"/>
-              <w:cnfStyle w:val="000000000000" w:firstRow="0" w:lastRow="0" w:firstColumn="0" w:lastColumn="0" w:oddVBand="0" w:evenVBand="0" w:oddHBand="0" w:evenHBand="0" w:firstRowFirstColumn="0" w:firstRowLastColumn="0" w:lastRowFirstColumn="0" w:lastRowLastColumn="0"/>
               <w:rPr>
                 <w:rFonts w:ascii="Times New Roman" w:eastAsia="Times New Roman" w:hAnsi="Times New Roman" w:cs="Times New Roman"/>
                 <w:sz w:val="20"/>
@@ -1756,7 +1831,6 @@
           </w:tcPr>
           <w:p>
             <w:pPr>
-              <w:cnfStyle w:val="000000000000" w:firstRow="0" w:lastRow="0" w:firstColumn="0" w:lastColumn="0" w:oddVBand="0" w:evenVBand="0" w:oddHBand="0" w:evenHBand="0" w:firstRowFirstColumn="0" w:firstRowLastColumn="0" w:lastRowFirstColumn="0" w:lastRowLastColumn="0"/>
               <w:rPr>
                 <w:rFonts w:ascii="Times New Roman" w:eastAsia="Times New Roman" w:hAnsi="Times New Roman" w:cs="Times New Roman"/>
                 <w:sz w:val="20"/>
@@ -1805,45 +1879,14 @@
                 <w:lang w:eastAsia="cs-CZ"/>
               </w:rPr>
             </w:pPr>
-            <w:proofErr w:type="spellStart"/>
-            <w:r>
-              <w:rPr>
-                <w:rFonts w:ascii="Arial" w:eastAsia="Times New Roman" w:hAnsi="Arial" w:cs="Arial"/>
-                <w:sz w:val="20"/>
-                <w:szCs w:val="24"/>
-                <w:lang w:eastAsia="cs-CZ"/>
-              </w:rPr>
-              <w:t>GITový</w:t>
-            </w:r>
-            <w:proofErr w:type="spellEnd"/>
-            <w:r>
-              <w:rPr>
-                <w:rFonts w:ascii="Arial" w:eastAsia="Times New Roman" w:hAnsi="Arial" w:cs="Arial"/>
-                <w:sz w:val="20"/>
-                <w:szCs w:val="24"/>
-                <w:lang w:eastAsia="cs-CZ"/>
-              </w:rPr>
-              <w:t xml:space="preserve"> </w:t>
-            </w:r>
-            <w:proofErr w:type="spellStart"/>
-            <w:r>
-              <w:rPr>
-                <w:rFonts w:ascii="Arial" w:eastAsia="Times New Roman" w:hAnsi="Arial" w:cs="Arial"/>
-                <w:sz w:val="20"/>
-                <w:szCs w:val="24"/>
-                <w:lang w:eastAsia="cs-CZ"/>
-              </w:rPr>
-              <w:t>repozitář</w:t>
-            </w:r>
-            <w:proofErr w:type="spellEnd"/>
-            <w:r>
-              <w:rPr>
-                <w:rFonts w:ascii="Arial" w:eastAsia="Times New Roman" w:hAnsi="Arial" w:cs="Arial"/>
-                <w:sz w:val="20"/>
-                <w:szCs w:val="24"/>
-                <w:lang w:eastAsia="cs-CZ"/>
-              </w:rPr>
-              <w:t xml:space="preserve"> s výsledným kódem</w:t>
+            <w:r>
+              <w:rPr>
+                <w:rFonts w:ascii="Arial" w:eastAsia="Times New Roman" w:hAnsi="Arial" w:cs="Arial"/>
+                <w:sz w:val="20"/>
+                <w:szCs w:val="24"/>
+                <w:lang w:eastAsia="cs-CZ"/>
+              </w:rPr>
+              <w:t>GITový repozitář s výsledným kódem</w:t>
             </w:r>
             <w:r>
               <w:rPr>
@@ -1853,19 +1896,8 @@
                 <w:lang w:eastAsia="cs-CZ"/>
               </w:rPr>
               <w:br/>
-              <w:t xml:space="preserve">Prosím uveďte link na </w:t>
-            </w:r>
-            <w:proofErr w:type="spellStart"/>
-            <w:r>
-              <w:rPr>
-                <w:rFonts w:ascii="Arial" w:eastAsia="Times New Roman" w:hAnsi="Arial" w:cs="Arial"/>
-                <w:sz w:val="20"/>
-                <w:szCs w:val="24"/>
-                <w:lang w:eastAsia="cs-CZ"/>
-              </w:rPr>
-              <w:t>repozitář</w:t>
-            </w:r>
-            <w:proofErr w:type="spellEnd"/>
+              <w:t>Prosím uveďte link na repozitář</w:t>
+            </w:r>
           </w:p>
         </w:tc>
         <w:tc>

</xml_diff>